<commit_message>
docs: fix MapStruct → Manual @Component Mapper trong báo cáo 2 & 3
</commit_message>
<xml_diff>
--- a/docs/BaoCao_2_PhanTichThietKe.docx
+++ b/docs/BaoCao_2_PhanTichThietKe.docx
@@ -1963,7 +1963,7 @@
           <w:sz w:val="24"/>
           <w:szCs w:val="24"/>
         </w:rPr>
-        <w:t xml:space="preserve">Để tách biệt tầng API và tầng nghiệp vụ, hệ thống sử dụng DTO và MapStruct:</w:t>
+        <w:t xml:space="preserve">Để tách biệt tầng API và tầng nghiệp vụ, hệ thống sử dụng DTO và Manual Mapper:</w:t>
       </w:r>
     </w:p>
     <w:p>
@@ -2053,7 +2053,7 @@
           <w:sz w:val="24"/>
           <w:szCs w:val="24"/>
         </w:rPr>
-        <w:t xml:space="preserve">PaperMapper (MapStruct): map Entity ↔ DTO, bắt buộc ignore trường embedding.</w:t>
+        <w:t xml:space="preserve">PaperMapper (@Component thủ công): map Entity ↔ DTO, trường embedding không có trong PaperResponse.</w:t>
       </w:r>
     </w:p>
     <w:p>
@@ -2317,7 +2317,7 @@
           <w:sz w:val="24"/>
           <w:szCs w:val="24"/>
         </w:rPr>
-        <w:t xml:space="preserve">dto — DTO và MapStruct mapper.</w:t>
+        <w:t xml:space="preserve">dto — DTO và manual mapper (@Component).</w:t>
       </w:r>
     </w:p>
     <w:p>

</xml_diff>